<commit_message>
Integrar datos del SIE de Banxico: 2020 completo, TIIE y rechazo por tamaño
- Excel: I-2020 a III-2026 en el diseño vigente con las series del SIE
  (niveles calculados de la variación anual y comprobados contra 643 datos
  publicados), TIIE 28 días y TIIE de fondeo, cuadros del comunicado II-2026,
  comparación del II trimestre por tamaño y destino del crédito a comercio
  exterior como componente de exportaciones.
- Informe Banxico y servicio social 2: cifras actualizadas, hipótesis H3, H4
  y H6 con datos, gráficas nuevas de rechazo por tamaño y de tasa/TIIE.

Co-Authored-By: Claude Opus 5.5 <noreply@anthropic.com>
Claude-Session: https://claude.ai/code/session_01SQMJVJnPtgfFVXT1F9eV8j
</commit_message>
<xml_diff>
--- a/servicio_social/servicio_social_2.docx
+++ b/servicio_social/servicio_social_2.docx
@@ -2677,7 +2677,7 @@
                 <w:rFonts w:ascii="Arial" w:hAnsi="Arial" w:cs="Arial"/>
                 <w:lang w:val="es-MX"/>
               </w:rPr>
-              <w:t xml:space="preserve">Se sostiene en parte; falta capturar la TIIE.</w:t>
+              <w:t xml:space="preserve">Se sostiene en parte: la TIIE a 28 días bajó de 11.40% (2023) a 6.97% (2026) y el crédito nuevo no subió.</w:t>
             </w:r>
           </w:p>
         </w:tc>
@@ -2715,7 +2715,7 @@
                 <w:rFonts w:ascii="Arial" w:hAnsi="Arial" w:cs="Arial"/>
                 <w:lang w:val="es-MX"/>
               </w:rPr>
-              <w:t xml:space="preserve">Sube el rechazo (23.4% en 2026 vs 6.4% en 2025); por tamaño, sin dato.</w:t>
+              <w:t xml:space="preserve">Se sostiene: en II-2026 se rechazó 28.3% de las solicitudes de pymes y 3.1% de las de grandes.</w:t>
             </w:r>
           </w:p>
         </w:tc>
@@ -2772,7 +2772,7 @@
                 <w:rFonts w:ascii="Arial" w:hAnsi="Arial" w:cs="Arial"/>
                 <w:lang w:val="es-MX"/>
               </w:rPr>
-              <w:t xml:space="preserve">H6. Las exportadoras tienen más acceso al crédito bancario.</w:t>
+              <w:t xml:space="preserve">H6. Las empresas ligadas al comercio exterior usan más el crédito bancario.</w:t>
             </w:r>
           </w:p>
         </w:tc>
@@ -2789,7 +2789,7 @@
                 <w:rFonts w:ascii="Arial" w:hAnsi="Arial" w:cs="Arial"/>
                 <w:lang w:val="es-MX"/>
               </w:rPr>
-              <w:t xml:space="preserve">Pendiente: el corte por exportadoras no está en los datos capturados.</w:t>
+              <w:t xml:space="preserve">Parcial: Banxico no separa exportadoras; el crédito usado para comercio exterior es mínimo (0.9% de las grandes y 0.0% de las pymes con crédito nuevo en II-2026).</w:t>
             </w:r>
           </w:p>
         </w:tc>
@@ -2805,7 +2805,7 @@
           <w:rFonts w:ascii="Arial" w:hAnsi="Arial" w:cs="Arial"/>
           <w:lang w:val="es-MX"/>
         </w:rPr>
-        <w:t xml:space="preserve">El crédito nuevo cayó durante la pandemia (de 24.2% en I-2020 a 16.8% en IV-2020, con la muestra anterior de Banxico), se recuperó en 2022-2023 y desde 2023 vuelve a bajar a razón de 1.0 punto por año. La encuesta del III-2026 se publica el 19 de noviembre de 2026.</w:t>
+        <w:t xml:space="preserve">El crédito nuevo cayó con la pandemia (de 14.8% en I-2020 a 10.6% en II-2020), se recuperó en 2022-2023 y desde 2023 vuelve a bajar a razón de 1.0 punto por año. La encuesta del III-2026 se publica el 19 de noviembre de 2026.</w:t>
       </w:r>
     </w:p>
     <w:p>
@@ -2869,7 +2869,7 @@
           <w:sz w:val="18"/>
           <w:lang w:val="es-MX"/>
         </w:rPr>
-        <w:t xml:space="preserve">Banxico, comunicados de la Encuesta de Evaluación Coyuntural del Mercado Crediticio: muestra anterior (I-2020 a II-2022) y diseño vigente (IV-2020 a II-2026). Datos: Excel, hoja Serie completa 2020-2026.</w:t>
+        <w:t xml:space="preserve">Banxico, SIE (Encuesta de Evaluación Coyuntural del Mercado Crediticio, diseño vigente, I-2020 a II-2026) y comunicados de la muestra anterior (referencia). Datos: Excel, hoja Serie completa 2020-2026.</w:t>
       </w:r>
     </w:p>
     <w:p>
@@ -2946,7 +2946,7 @@
           <w:sz w:val="18"/>
           <w:lang w:val="es-MX"/>
         </w:rPr>
-        <w:t xml:space="preserve">Banxico, comunicados de la encuesta, diseño vigente IV-2020 a II-2026. Datos: Excel, hojas Series y Por tamaño.</w:t>
+        <w:t xml:space="preserve">Banxico, SIE y comunicados de la encuesta, diseño vigente I-2020 a II-2026. Datos: Excel, hojas Series y Por tamaño.</w:t>
       </w:r>
     </w:p>
     <w:p>
@@ -3120,7 +3120,7 @@
                 <w:rFonts w:ascii="Arial" w:hAnsi="Arial" w:cs="Arial"/>
                 <w:lang w:val="es-MX"/>
               </w:rPr>
-              <w:t xml:space="preserve">2020 (IV)</w:t>
+              <w:t xml:space="preserve">2020</w:t>
             </w:r>
           </w:p>
         </w:tc>
@@ -3138,7 +3138,7 @@
                 <w:rFonts w:ascii="Arial" w:hAnsi="Arial" w:cs="Arial"/>
                 <w:lang w:val="es-MX"/>
               </w:rPr>
-              <w:t xml:space="preserve">46.9</w:t>
+              <w:t xml:space="preserve">52.9</w:t>
             </w:r>
           </w:p>
         </w:tc>
@@ -3156,7 +3156,7 @@
                 <w:rFonts w:ascii="Arial" w:hAnsi="Arial" w:cs="Arial"/>
                 <w:lang w:val="es-MX"/>
               </w:rPr>
-              <w:t xml:space="preserve">38.7</w:t>
+              <w:t xml:space="preserve">36.4</w:t>
             </w:r>
           </w:p>
         </w:tc>
@@ -3174,7 +3174,7 @@
                 <w:rFonts w:ascii="Arial" w:hAnsi="Arial" w:cs="Arial"/>
                 <w:lang w:val="es-MX"/>
               </w:rPr>
-              <w:t xml:space="preserve">8.2</w:t>
+              <w:t xml:space="preserve">16.5</w:t>
             </w:r>
           </w:p>
         </w:tc>
@@ -3192,7 +3192,7 @@
                 <w:rFonts w:ascii="Arial" w:hAnsi="Arial" w:cs="Arial"/>
                 <w:lang w:val="es-MX"/>
               </w:rPr>
-              <w:t xml:space="preserve">n.d.</w:t>
+              <w:t xml:space="preserve">27.3</w:t>
             </w:r>
           </w:p>
         </w:tc>
@@ -3210,7 +3210,7 @@
                 <w:rFonts w:ascii="Arial" w:hAnsi="Arial" w:cs="Arial"/>
                 <w:lang w:val="es-MX"/>
               </w:rPr>
-              <w:t xml:space="preserve">n.d.</w:t>
+              <w:t xml:space="preserve">11.1</w:t>
             </w:r>
           </w:p>
         </w:tc>
@@ -3302,7 +3302,7 @@
                 <w:rFonts w:ascii="Arial" w:hAnsi="Arial" w:cs="Arial"/>
                 <w:lang w:val="es-MX"/>
               </w:rPr>
-              <w:t xml:space="preserve">n.d.</w:t>
+              <w:t xml:space="preserve">23.7</w:t>
             </w:r>
           </w:p>
         </w:tc>
@@ -3320,7 +3320,7 @@
                 <w:rFonts w:ascii="Arial" w:hAnsi="Arial" w:cs="Arial"/>
                 <w:lang w:val="es-MX"/>
               </w:rPr>
-              <w:t xml:space="preserve">n.d.</w:t>
+              <w:t xml:space="preserve">10.3</w:t>
             </w:r>
           </w:p>
         </w:tc>
@@ -3412,7 +3412,7 @@
                 <w:rFonts w:ascii="Arial" w:hAnsi="Arial" w:cs="Arial"/>
                 <w:lang w:val="es-MX"/>
               </w:rPr>
-              <w:t xml:space="preserve">20.5</w:t>
+              <w:t xml:space="preserve">23.0</w:t>
             </w:r>
           </w:p>
         </w:tc>
@@ -3430,7 +3430,7 @@
                 <w:rFonts w:ascii="Arial" w:hAnsi="Arial" w:cs="Arial"/>
                 <w:lang w:val="es-MX"/>
               </w:rPr>
-              <w:t xml:space="preserve">13.0</w:t>
+              <w:t xml:space="preserve">13.9</w:t>
             </w:r>
           </w:p>
         </w:tc>
@@ -3522,7 +3522,7 @@
                 <w:rFonts w:ascii="Arial" w:hAnsi="Arial" w:cs="Arial"/>
                 <w:lang w:val="es-MX"/>
               </w:rPr>
-              <w:t xml:space="preserve">20.1</w:t>
+              <w:t xml:space="preserve">20.0</w:t>
             </w:r>
           </w:p>
         </w:tc>
@@ -3540,7 +3540,7 @@
                 <w:rFonts w:ascii="Arial" w:hAnsi="Arial" w:cs="Arial"/>
                 <w:lang w:val="es-MX"/>
               </w:rPr>
-              <w:t xml:space="preserve">14.7</w:t>
+              <w:t xml:space="preserve">14.9</w:t>
             </w:r>
           </w:p>
         </w:tc>
@@ -3742,7 +3742,7 @@
                 <w:rFonts w:ascii="Arial" w:hAnsi="Arial" w:cs="Arial"/>
                 <w:lang w:val="es-MX"/>
               </w:rPr>
-              <w:t xml:space="preserve">21.8</w:t>
+              <w:t xml:space="preserve">22.4</w:t>
             </w:r>
           </w:p>
         </w:tc>
@@ -3760,7 +3760,7 @@
                 <w:rFonts w:ascii="Arial" w:hAnsi="Arial" w:cs="Arial"/>
                 <w:lang w:val="es-MX"/>
               </w:rPr>
-              <w:t xml:space="preserve">14.3</w:t>
+              <w:t xml:space="preserve">13.5</w:t>
             </w:r>
           </w:p>
         </w:tc>
@@ -3888,11 +3888,52 @@
           <w:rFonts w:ascii="Arial" w:hAnsi="Arial" w:cs="Arial"/>
           <w:lang w:val="es-MX"/>
         </w:rPr>
-        <w:t xml:space="preserve">En 2026 la tasa de rechazo subió a 23.4% (6.4% en 2025) y el índice de costo de las tasas bajó a 39.4 en II-2026 (abajo de 50 significa crédito más caro). En ese trimestre las pymes perciben el crédito más caro (35.3) y las grandes más barato (53.7).</w:t>
+        <w:t xml:space="preserve">En 2026 la tasa de rechazo subió a 23.4% (6.4% en 2025) y el índice de costo de las tasas bajó a 39.4 en II-2026 (abajo de 50 significa crédito más caro). El aumento del rechazo es de las pymes: comparando el II trimestre de cada año, a ellas se les rechazó 28.3% de las solicitudes en 2026, contra 4.7% en 2025; a las grandes, 3.1%. También perciben el crédito más caro (35.3 contra 53.7 de las grandes).</w:t>
       </w:r>
     </w:p>
     <w:p>
       <w:pPr>
+        <w:keepNext/>
+        <w:spacing w:line="360" w:lineRule="auto"/>
+        <w:jc w:val="center"/>
+      </w:pPr>
+      <w:r>
+        <w:drawing>
+          <wp:inline xmlns:a="http://schemas.openxmlformats.org/drawingml/2006/main" xmlns:pic="http://schemas.openxmlformats.org/drawingml/2006/picture">
+            <wp:extent cx="5486400" cy="2560320"/>
+            <wp:docPr id="4" name="Picture 4" descr="Tasa de rechazo por tamaño en el II trimestre"/>
+            <wp:cNvGraphicFramePr>
+              <a:graphicFrameLocks noChangeAspect="1"/>
+            </wp:cNvGraphicFramePr>
+            <a:graphic>
+              <a:graphicData uri="http://schemas.openxmlformats.org/drawingml/2006/picture">
+                <pic:pic>
+                  <pic:nvPicPr>
+                    <pic:cNvPr id="0" name="g6_rechazo_tamano.png" descr="Tasa de rechazo por tamaño en el II trimestre"/>
+                    <pic:cNvPicPr/>
+                  </pic:nvPicPr>
+                  <pic:blipFill>
+                    <a:blip r:embed="rId49"/>
+                    <a:stretch>
+                      <a:fillRect/>
+                    </a:stretch>
+                  </pic:blipFill>
+                  <pic:spPr>
+                    <a:xfrm>
+                      <a:off x="0" y="0"/>
+                      <a:ext cx="5486400" cy="2560320"/>
+                    </a:xfrm>
+                    <a:prstGeom prst="rect"/>
+                  </pic:spPr>
+                </pic:pic>
+              </a:graphicData>
+            </a:graphic>
+          </wp:inline>
+        </w:drawing>
+      </w:r>
+    </w:p>
+    <w:p>
+      <w:pPr>
         <w:spacing w:line="360" w:lineRule="auto"/>
         <w:jc w:val="both"/>
       </w:pPr>
@@ -3900,16 +3941,18 @@
         <w:rPr>
           <w:rFonts w:ascii="Arial" w:hAnsi="Arial" w:cs="Arial"/>
           <w:b/>
-          <w:lang w:val="es-MX"/>
-        </w:rPr>
-        <w:t xml:space="preserve">Exportaciones. </w:t>
-      </w:r>
-      <w:r>
-        <w:rPr>
-          <w:rFonts w:ascii="Arial" w:hAnsi="Arial" w:cs="Arial"/>
-          <w:lang w:val="es-MX"/>
-        </w:rPr>
-        <w:t xml:space="preserve">Para Plan México importa saber si las exportadoras tienen mejor acceso al crédito. El corte por exportadoras no está en las cifras capturadas; queda como hipótesis por probar (H6) y como pendiente en el Excel.</w:t>
+          <w:sz w:val="18"/>
+          <w:lang w:val="es-MX"/>
+        </w:rPr>
+        <w:t xml:space="preserve">Figura 4 · Fuente: </w:t>
+      </w:r>
+      <w:r>
+        <w:rPr>
+          <w:rFonts w:ascii="Arial" w:hAnsi="Arial" w:cs="Arial"/>
+          <w:sz w:val="18"/>
+          <w:lang w:val="es-MX"/>
+        </w:rPr>
+        <w:t xml:space="preserve">Banxico, comunicado II-2026 (cuadro 2) y SIE (variación anual) para II-2020 a II-2025; cálculo propio. Datos: Excel, hoja Rechazo y costo.</w:t>
       </w:r>
     </w:p>
     <w:p>
@@ -3920,9 +3963,30 @@
       <w:r>
         <w:rPr>
           <w:rFonts w:ascii="Arial" w:hAnsi="Arial" w:cs="Arial"/>
-          <w:lang w:val="es-MX"/>
-        </w:rPr>
-        <w:t xml:space="preserve">Leídos junto con la ENAFIN, los datos de Banxico cuentan la misma historia con más detalle en el tiempo: la pyme no solo tiene menos acceso, sino que en 2026 lo está perdiendo, justo cuando Plan México le pide a la banca más crédito para ese segmento.</w:t>
+          <w:b/>
+          <w:lang w:val="es-MX"/>
+        </w:rPr>
+        <w:t xml:space="preserve">Exportaciones. </w:t>
+      </w:r>
+      <w:r>
+        <w:rPr>
+          <w:rFonts w:ascii="Arial" w:hAnsi="Arial" w:cs="Arial"/>
+          <w:lang w:val="es-MX"/>
+        </w:rPr>
+        <w:t xml:space="preserve">Para Plan México importa saber si las empresas ligadas al comercio exterior tienen mejor acceso al crédito. Banxico no separa exportadoras en esta encuesta; lo más cercano es el destino del crédito nuevo. En II-2026 solo 0.9% de las grandes y 0.0% de las pymes que usaron crédito nuevo lo destinaron a operaciones de comercio exterior: el componente exportador del crédito bancario es marginal.</w:t>
+      </w:r>
+    </w:p>
+    <w:p>
+      <w:pPr>
+        <w:spacing w:line="360" w:lineRule="auto"/>
+        <w:jc w:val="both"/>
+      </w:pPr>
+      <w:r>
+        <w:rPr>
+          <w:rFonts w:ascii="Arial" w:hAnsi="Arial" w:cs="Arial"/>
+          <w:lang w:val="es-MX"/>
+        </w:rPr>
+        <w:t xml:space="preserve">Leídos junto con la ENAFIN, los datos de Banxico cuentan la misma historia con más detalle en el tiempo: la pyme no solo tiene menos acceso, sino que en 2026 lo está perdiendo, aunque la TIIE bajó de 11.40% a 6.97% y justo cuando Plan México le pide a la banca más crédito para ese segmento.</w:t>
       </w:r>
     </w:p>
     <w:p>
@@ -8656,7 +8720,7 @@
         </w:rPr>
         <w:t xml:space="preserve"> [Comunicado de prensa; muestra anterior, series de 2020]. </w:t>
       </w:r>
-      <w:hyperlink r:id="rId49" w:history="1">
+      <w:hyperlink r:id="rId50" w:history="1">
         <w:r>
           <w:rPr>
             <w:rStyle w:val="Hipervnculo"/>
@@ -8699,7 +8763,7 @@
         </w:rPr>
         <w:t xml:space="preserve"> [Comunicado de prensa]. </w:t>
       </w:r>
-      <w:hyperlink r:id="rId50" w:history="1">
+      <w:hyperlink r:id="rId51" w:history="1">
         <w:r>
           <w:rPr>
             <w:rStyle w:val="Hipervnculo"/>
@@ -8707,6 +8771,49 @@
             <w:lang w:val="es-MX"/>
           </w:rPr>
           <w:t xml:space="preserve">Banxico</w:t>
+        </w:r>
+      </w:hyperlink>
+    </w:p>
+    <w:p>
+      <w:pPr>
+        <w:pStyle w:val="Prrafodelista"/>
+        <w:numPr>
+          <w:ilvl w:val="0"/>
+          <w:numId w:val="3"/>
+        </w:numPr>
+        <w:spacing w:line="360" w:lineRule="auto"/>
+        <w:jc w:val="both"/>
+      </w:pPr>
+      <w:r>
+        <w:rPr>
+          <w:rFonts w:ascii="Arial" w:hAnsi="Arial" w:cs="Arial"/>
+          <w:lang w:val="es-MX"/>
+        </w:rPr>
+        <w:t xml:space="preserve">Banco de México. (2026). </w:t>
+      </w:r>
+      <w:r>
+        <w:rPr>
+          <w:rFonts w:ascii="Arial" w:hAnsi="Arial" w:cs="Arial"/>
+          <w:i/>
+          <w:lang w:val="es-MX"/>
+        </w:rPr>
+        <w:t xml:space="preserve">Sistema de Información Económica: resultados de la encuesta de evaluación coyuntural del mercado crediticio; TIIE a 28 días</w:t>
+      </w:r>
+      <w:r>
+        <w:rPr>
+          <w:rFonts w:ascii="Arial" w:hAnsi="Arial" w:cs="Arial"/>
+          <w:lang w:val="es-MX"/>
+        </w:rPr>
+        <w:t xml:space="preserve"> [Base de datos, consultada el 14 de octubre de 2026]. </w:t>
+      </w:r>
+      <w:hyperlink r:id="rId52" w:history="1">
+        <w:r>
+          <w:rPr>
+            <w:rStyle w:val="Hipervnculo"/>
+            <w:rFonts w:ascii="Arial" w:hAnsi="Arial" w:cs="Arial"/>
+            <w:lang w:val="es-MX"/>
+          </w:rPr>
+          <w:t xml:space="preserve">SIE</w:t>
         </w:r>
       </w:hyperlink>
     </w:p>

</xml_diff>